<commit_message>
先说 SQLGlot/jOOQ/RISE 这类 statement-level translator 为什么不能直接解决 fuzzing seed generation； 再说 LLM-based seed generation 相关工作； 然后重点对比 SedaR； 最后落到 Morph：test-case-level AQT + parser/executor feedback，保留结构并修复 fuzzer-incompatible constructs。
</commit_message>
<xml_diff>
--- a/修改计划.docx
+++ b/修改计划.docx
@@ -2153,23 +2153,33 @@
         <w:rPr>
           <w:rFonts w:ascii="微软雅黑" w:hAnsi="微软雅黑" w:eastAsia="微软雅黑"/>
           <w:b/>
-          <w:sz w:val="18"/>
-          <w:highlight w:val="yellow"/>
-        </w:rPr>
-      </w:pPr>
-      <w:r>
-        <w:rPr>
-          <w:rFonts w:hint="default"/>
+          <w:strike/>
+          <w:dstrike w:val="0"/>
+          <w:sz w:val="18"/>
+          <w:highlight w:val="yellow"/>
+        </w:rPr>
+      </w:pPr>
+      <w:r>
+        <w:rPr>
+          <w:rFonts w:hint="default"/>
+          <w:strike/>
+          <w:dstrike w:val="0"/>
         </w:rPr>
         <w:t>### Comment1: How are dialect-specific constructs automatically identified during AQT extraction?</w:t>
       </w:r>
       <w:r>
+        <w:rPr>
+          <w:strike/>
+          <w:dstrike w:val="0"/>
+        </w:rPr>
         <w:t xml:space="preserve">  </w:t>
       </w:r>
       <w:r>
         <w:rPr>
           <w:rFonts w:ascii="微软雅黑" w:hAnsi="微软雅黑" w:eastAsia="微软雅黑"/>
           <w:b/>
+          <w:strike/>
+          <w:dstrike w:val="0"/>
           <w:sz w:val="18"/>
           <w:highlight w:val="yellow"/>
         </w:rPr>
@@ -2179,11 +2189,17 @@
     <w:p>
       <w:pPr>
         <w:bidi w:val="0"/>
+        <w:rPr>
+          <w:strike/>
+          <w:dstrike w:val="0"/>
+        </w:rPr>
       </w:pPr>
       <w:r>
         <w:rPr>
           <w:rFonts w:hint="eastAsia" w:ascii="微软雅黑" w:hAnsi="微软雅黑" w:eastAsia="微软雅黑"/>
           <w:b/>
+          <w:strike/>
+          <w:dstrike w:val="0"/>
           <w:sz w:val="18"/>
           <w:highlight w:val="yellow"/>
           <w:lang w:eastAsia="zh-CN"/>
@@ -2194,6 +2210,8 @@
         <w:rPr>
           <w:rFonts w:ascii="微软雅黑" w:hAnsi="微软雅黑" w:eastAsia="微软雅黑"/>
           <w:b/>
+          <w:strike/>
+          <w:dstrike w:val="0"/>
           <w:sz w:val="18"/>
           <w:highlight w:val="yellow"/>
         </w:rPr>
@@ -2203,10 +2221,16 @@
     <w:p>
       <w:pPr>
         <w:bidi w:val="0"/>
-      </w:pPr>
-      <w:r>
-        <w:rPr>
-          <w:rFonts w:hint="default"/>
+        <w:rPr>
+          <w:strike/>
+          <w:dstrike w:val="0"/>
+        </w:rPr>
+      </w:pPr>
+      <w:r>
+        <w:rPr>
+          <w:rFonts w:hint="default"/>
+          <w:strike/>
+          <w:dstrike w:val="0"/>
         </w:rPr>
         <w:t>Dialect-specific constructs are identified by querying dialect rule database. If a node matches a dialect rule, it is marked as dialect-specific and abstracted in the AQT. Otherwise, [todo 生成规则]</w:t>
       </w:r>
@@ -2214,40 +2238,138 @@
     <w:p>
       <w:pPr>
         <w:bidi w:val="0"/>
-      </w:pPr>
-      <w:r>
-        <w:rPr>
-          <w:rFonts w:hint="default"/>
+        <w:rPr>
+          <w:strike/>
+          <w:dstrike w:val="0"/>
+        </w:rPr>
+      </w:pPr>
+      <w:r>
+        <w:rPr>
+          <w:rFonts w:hint="default"/>
+          <w:strike/>
+          <w:dstrike w:val="0"/>
         </w:rPr>
         <w:t>For example, if the database contains AGE(x, y) → &lt;TimeDiff&gt;, then AGE(birth_date, CURRENT_DATE) is recognized as a PostgreSQL-specific construct and replaced with &lt;TimeDiff&gt;; unmatched nodes are preserved unchanged.</w:t>
       </w:r>
+    </w:p>
+    <w:p>
+      <w:pPr>
+        <w:bidi w:val="0"/>
+      </w:pPr>
+    </w:p>
+    <w:p>
+      <w:pPr>
+        <w:bidi w:val="0"/>
+        <w:rPr>
+          <w:rFonts w:ascii="微软雅黑" w:hAnsi="微软雅黑" w:eastAsia="微软雅黑"/>
+          <w:b/>
+          <w:strike/>
+          <w:dstrike w:val="0"/>
+          <w:sz w:val="18"/>
+          <w:highlight w:val="yellow"/>
+        </w:rPr>
+      </w:pPr>
+      <w:r>
+        <w:rPr>
+          <w:rFonts w:hint="default"/>
+          <w:strike/>
+          <w:dstrike w:val="0"/>
+        </w:rPr>
+        <w:t>### Comment2: Do LLM-generated rules get verified before caching?</w:t>
+      </w:r>
+      <w:r>
+        <w:rPr>
+          <w:strike/>
+          <w:dstrike w:val="0"/>
+        </w:rPr>
+        <w:t xml:space="preserve">  </w:t>
+      </w:r>
+      <w:r>
+        <w:rPr>
+          <w:rFonts w:ascii="微软雅黑" w:hAnsi="微软雅黑" w:eastAsia="微软雅黑"/>
+          <w:b/>
+          <w:strike/>
+          <w:dstrike w:val="0"/>
+          <w:sz w:val="18"/>
+          <w:highlight w:val="yellow"/>
+        </w:rPr>
+        <w:t>【类别：方法澄清；</w:t>
+      </w:r>
+    </w:p>
+    <w:p>
+      <w:pPr>
+        <w:bidi w:val="0"/>
+        <w:rPr>
+          <w:strike/>
+          <w:dstrike w:val="0"/>
+        </w:rPr>
+      </w:pPr>
+      <w:r>
+        <w:rPr>
+          <w:rFonts w:hint="eastAsia" w:ascii="微软雅黑" w:hAnsi="微软雅黑" w:eastAsia="微软雅黑"/>
+          <w:b/>
+          <w:strike/>
+          <w:dstrike w:val="0"/>
+          <w:sz w:val="18"/>
+          <w:highlight w:val="yellow"/>
+          <w:lang w:eastAsia="zh-CN"/>
+        </w:rPr>
+        <w:t>待修改</w:t>
+      </w:r>
+      <w:r>
+        <w:rPr>
+          <w:rFonts w:ascii="微软雅黑" w:hAnsi="微软雅黑" w:eastAsia="微软雅黑"/>
+          <w:b/>
+          <w:strike/>
+          <w:dstrike w:val="0"/>
+          <w:sz w:val="18"/>
+          <w:highlight w:val="yellow"/>
+        </w:rPr>
+        <w:t>：Algorithm 2 和 Rule Generation 段。修改逻辑：把当前生成后直接 Cache 的表述改成生成候选规则，实例化并 parser validation，成功后才写入 KB；明确未验证规则不缓存。】</w:t>
+      </w:r>
+    </w:p>
+    <w:p>
+      <w:pPr>
+        <w:bidi w:val="0"/>
+        <w:rPr>
+          <w:strike/>
+          <w:dstrike w:val="0"/>
+        </w:rPr>
+      </w:pPr>
+      <w:r>
+        <w:rPr>
+          <w:rFonts w:hint="default"/>
+          <w:strike/>
+          <w:dstrike w:val="0"/>
+        </w:rPr>
+        <w:t>LLM-generated rules are verified before caching with two steps: (1) apply the generated rule and validate it with the target DBMS parser; if parsing fails, repair it using the Error Fixer until validation succeeds; (2) cache the rule into the knowledge base only after successful validation.</w:t>
+      </w:r>
+    </w:p>
+    <w:p>
+      <w:pPr>
+        <w:bidi w:val="0"/>
+      </w:pPr>
+    </w:p>
+    <w:p>
+      <w:pPr>
+        <w:bidi w:val="0"/>
+        <w:rPr>
+          <w:rFonts w:ascii="微软雅黑" w:hAnsi="微软雅黑" w:eastAsia="微软雅黑"/>
+          <w:b/>
+          <w:strike/>
+          <w:dstrike w:val="0"/>
+          <w:sz w:val="18"/>
+          <w:highlight w:val="yellow"/>
+        </w:rPr>
+      </w:pPr>
       <w:bookmarkStart w:id="0" w:name="_GoBack"/>
-      <w:bookmarkEnd w:id="0"/>
-    </w:p>
-    <w:p>
-      <w:pPr>
-        <w:bidi w:val="0"/>
-      </w:pPr>
-    </w:p>
-    <w:p>
-      <w:pPr>
-        <w:bidi w:val="0"/>
-        <w:rPr>
-          <w:rFonts w:ascii="微软雅黑" w:hAnsi="微软雅黑" w:eastAsia="微软雅黑"/>
-          <w:b/>
-          <w:strike/>
-          <w:dstrike w:val="0"/>
-          <w:sz w:val="18"/>
-          <w:highlight w:val="yellow"/>
-        </w:rPr>
-      </w:pPr>
-      <w:r>
-        <w:rPr>
-          <w:rFonts w:hint="default"/>
-          <w:strike/>
-          <w:dstrike w:val="0"/>
-        </w:rPr>
-        <w:t>### Comment2: Do LLM-generated rules get verified before caching?</w:t>
+      <w:r>
+        <w:rPr>
+          <w:rFonts w:hint="default"/>
+          <w:strike/>
+          <w:dstrike w:val="0"/>
+        </w:rPr>
+        <w:t>### Comment3: Presentation issues</w:t>
       </w:r>
       <w:r>
         <w:rPr>
@@ -2265,7 +2387,7 @@
           <w:sz w:val="18"/>
           <w:highlight w:val="yellow"/>
         </w:rPr>
-        <w:t>【类别：方法澄清；</w:t>
+        <w:t>【类别：简单修改；</w:t>
       </w:r>
     </w:p>
     <w:p>
@@ -2297,99 +2419,6 @@
           <w:sz w:val="18"/>
           <w:highlight w:val="yellow"/>
         </w:rPr>
-        <w:t>：Algorithm 2 和 Rule Generation 段。修改逻辑：把当前生成后直接 Cache 的表述改成生成候选规则，实例化并 parser validation，成功后才写入 KB；明确未验证规则不缓存。】</w:t>
-      </w:r>
-    </w:p>
-    <w:p>
-      <w:pPr>
-        <w:bidi w:val="0"/>
-        <w:rPr>
-          <w:strike/>
-          <w:dstrike w:val="0"/>
-        </w:rPr>
-      </w:pPr>
-      <w:r>
-        <w:rPr>
-          <w:rFonts w:hint="default"/>
-          <w:strike/>
-          <w:dstrike w:val="0"/>
-        </w:rPr>
-        <w:t>LLM-generated rules are verified before caching with two steps: (1) apply the generated rule and validate it with the target DBMS parser; if parsing fails, repair it using the Error Fixer until validation succeeds; (2) cache the rule into the knowledge base only after successful validation.</w:t>
-      </w:r>
-    </w:p>
-    <w:p>
-      <w:pPr>
-        <w:bidi w:val="0"/>
-      </w:pPr>
-    </w:p>
-    <w:p>
-      <w:pPr>
-        <w:bidi w:val="0"/>
-        <w:rPr>
-          <w:rFonts w:ascii="微软雅黑" w:hAnsi="微软雅黑" w:eastAsia="微软雅黑"/>
-          <w:b/>
-          <w:strike w:val="0"/>
-          <w:dstrike w:val="0"/>
-          <w:sz w:val="18"/>
-          <w:highlight w:val="yellow"/>
-        </w:rPr>
-      </w:pPr>
-      <w:r>
-        <w:rPr>
-          <w:rFonts w:hint="default"/>
-          <w:strike w:val="0"/>
-          <w:dstrike w:val="0"/>
-        </w:rPr>
-        <w:t>### Comment3: Presentation issues</w:t>
-      </w:r>
-      <w:r>
-        <w:rPr>
-          <w:strike w:val="0"/>
-          <w:dstrike w:val="0"/>
-        </w:rPr>
-        <w:t xml:space="preserve">  </w:t>
-      </w:r>
-      <w:r>
-        <w:rPr>
-          <w:rFonts w:ascii="微软雅黑" w:hAnsi="微软雅黑" w:eastAsia="微软雅黑"/>
-          <w:b/>
-          <w:strike w:val="0"/>
-          <w:dstrike w:val="0"/>
-          <w:sz w:val="18"/>
-          <w:highlight w:val="yellow"/>
-        </w:rPr>
-        <w:t>【类别：简单修改；</w:t>
-      </w:r>
-    </w:p>
-    <w:p>
-      <w:pPr>
-        <w:bidi w:val="0"/>
-        <w:rPr>
-          <w:strike w:val="0"/>
-          <w:dstrike w:val="0"/>
-        </w:rPr>
-      </w:pPr>
-      <w:r>
-        <w:rPr>
-          <w:rFonts w:hint="eastAsia" w:ascii="微软雅黑" w:hAnsi="微软雅黑" w:eastAsia="微软雅黑"/>
-          <w:b/>
-          <w:strike w:val="0"/>
-          <w:dstrike w:val="0"/>
-          <w:sz w:val="18"/>
-          <w:highlight w:val="yellow"/>
-          <w:lang w:eastAsia="zh-CN"/>
-        </w:rPr>
-        <w:t>待修改</w:t>
-      </w:r>
-      <w:r>
-        <w:rPr>
-          <w:rFonts w:ascii="微软雅黑" w:hAnsi="微软雅黑" w:eastAsia="微软雅黑"/>
-          <w:b/>
-          <w:strike w:val="0"/>
-          <w:dstrike w:val="0"/>
-          <w:sz w:val="18"/>
-          <w:highlight w:val="yellow"/>
-        </w:rPr>
         <w:t>：全文一致性检查。修改逻辑：修复 algorithm number reference、error-message typo、Figure 4 符号、Table 6 引用、TODO 和 citation placeholder。】</w:t>
       </w:r>
     </w:p>
@@ -2404,6 +2433,7 @@
         <w:t>Thanks,we will fix them in the revision.</w:t>
       </w:r>
     </w:p>
+    <w:bookmarkEnd w:id="0"/>
     <w:p>
       <w:pPr>
         <w:bidi w:val="0"/>

</xml_diff>